<commit_message>
paper: full English, headings ALL CAPS sesuai template Ultimatics
</commit_message>
<xml_diff>
--- a/paper_ultimatics.docx
+++ b/paper_ultimatics.docx
@@ -44,7 +44,7 @@
           <w:i w:val="0"/>
           <w:sz w:val="18"/>
         </w:rPr>
-        <w:t>¹Program Studi Informatika, Universitas Darussalam Gontor, Indonesia</w:t>
+        <w:t>¹Department of Informatics, Universitas Darussalam Gontor, Ponorogo, Indonesia</w:t>
       </w:r>
     </w:p>
     <w:p>
@@ -59,7 +59,7 @@
           <w:i w:val="0"/>
           <w:sz w:val="18"/>
         </w:rPr>
-        <w:t>²Program Studi Informatika, Universitas Darussalam Gontor, Indonesia</w:t>
+        <w:t>²Department of Informatics, Universitas Darussalam Gontor, Ponorogo, Indonesia</w:t>
       </w:r>
     </w:p>
     <w:p>
@@ -134,7 +134,7 @@
           <w:i w:val="0"/>
           <w:sz w:val="20"/>
         </w:rPr>
-        <w:t>1. INTRODUCTION</w:t>
+        <w:t>INTRODUCTION</w:t>
       </w:r>
     </w:p>
     <w:p>
@@ -193,7 +193,7 @@
           <w:i w:val="0"/>
           <w:sz w:val="20"/>
         </w:rPr>
-        <w:t>2. RELATED WORK</w:t>
+        <w:t>RELATED WORK</w:t>
       </w:r>
     </w:p>
     <w:p>
@@ -267,7 +267,7 @@
           <w:i w:val="0"/>
           <w:sz w:val="20"/>
         </w:rPr>
-        <w:t>3. METHOD</w:t>
+        <w:t>METHOD</w:t>
       </w:r>
     </w:p>
     <w:p>
@@ -397,7 +397,7 @@
           <w:i w:val="0"/>
           <w:sz w:val="20"/>
         </w:rPr>
-        <w:t>4. RESULTS AND DISCUSSION</w:t>
+        <w:t>RESULTS AND DISCUSSION</w:t>
       </w:r>
     </w:p>
     <w:p>
@@ -571,7 +571,7 @@
           <w:i w:val="0"/>
           <w:sz w:val="20"/>
         </w:rPr>
-        <w:t>5. CONCLUSION</w:t>
+        <w:t>CONCLUSION</w:t>
       </w:r>
     </w:p>
     <w:p>

</xml_diff>